<commit_message>
Ajustes finais do TCC: linguagem associativa, limitacoes reforcadas, sincronizacao de numeros
</commit_message>
<xml_diff>
--- a/Resultados_Preliminares_Maycon.docx
+++ b/Resultados_Preliminares_Maycon.docx
@@ -8,18 +8,12 @@
         <w:jc w:val="both"/>
       </w:pPr>
       <w:r>
-        <w:rPr>
-          <w:rFonts w:ascii="Arial" w:hAnsi="Arial"/>
-          <w:b w:val="0"/>
-          <w:i w:val="0"/>
-          <w:sz w:val="22"/>
-        </w:rPr>
-        <w:t>Fatores determinantes da insatisfação do consumidor no e-commerce: uma aplicação de regressão para dados de contagem</w:t>
+        <w:t>Fatores determinantes da insatisfação do consumidor no e-commerce: aplicação de regressão para dados de contagem</w:t>
       </w:r>
     </w:p>
     <w:p>
       <w:pPr>
-        <w:spacing w:before="0" w:after="80" w:line="330" w:lineRule="exact"/>
+        <w:spacing w:before="0" w:after="0" w:line="330" w:lineRule="exact"/>
         <w:jc w:val="both"/>
       </w:pPr>
       <w:r>
@@ -29,37 +23,7 @@
           <w:i w:val="0"/>
           <w:sz w:val="22"/>
         </w:rPr>
-        <w:t>Maycon Henrique Aranha Da Silva¹*; Gustavo Dantas Lobo²</w:t>
-      </w:r>
-    </w:p>
-    <w:p>
-      <w:pPr>
-        <w:spacing w:before="0" w:after="40" w:line="220" w:lineRule="exact"/>
-        <w:jc w:val="both"/>
-      </w:pPr>
-      <w:r>
-        <w:rPr>
-          <w:rFonts w:ascii="Arial" w:hAnsi="Arial"/>
-          <w:b w:val="0"/>
-          <w:i w:val="0"/>
-          <w:sz w:val="18"/>
-        </w:rPr>
-        <w:t>¹* MBA em Data Science e Analytics, USP/Esalq. E-mail autor correspondente: maicodob@gmail.com</w:t>
-      </w:r>
-    </w:p>
-    <w:p>
-      <w:pPr>
-        <w:spacing w:before="0" w:after="0" w:line="220" w:lineRule="exact"/>
-        <w:jc w:val="both"/>
-      </w:pPr>
-      <w:r>
-        <w:rPr>
-          <w:rFonts w:ascii="Arial" w:hAnsi="Arial"/>
-          <w:b w:val="0"/>
-          <w:i w:val="0"/>
-          <w:sz w:val="18"/>
-        </w:rPr>
-        <w:t>² Orientador. MBA em Data Science e Analytics, USP/Esalq.</w:t>
+        <w:t>Maycon Henrique Aranha Da Silva; Gustavo Dantas Lobo</w:t>
       </w:r>
     </w:p>
     <w:p>
@@ -73,13 +37,7 @@
         <w:jc w:val="both"/>
       </w:pPr>
       <w:r>
-        <w:rPr>
-          <w:rFonts w:ascii="Arial" w:hAnsi="Arial"/>
-          <w:b w:val="0"/>
-          <w:i w:val="0"/>
-          <w:sz w:val="22"/>
-        </w:rPr>
-        <w:t>Fatores determinantes da insatisfação do consumidor no e-commerce: uma aplicação de regressão para dados de contagem</w:t>
+        <w:t>Fatores determinantes da insatisfação do consumidor no e-commerce: aplicação de regressão para dados de contagem</w:t>
       </w:r>
     </w:p>
     <w:p>
@@ -103,18 +61,12 @@
         <w:jc w:val="both"/>
       </w:pPr>
       <w:r>
-        <w:rPr>
-          <w:rFonts w:ascii="Arial" w:hAnsi="Arial"/>
-          <w:b w:val="0"/>
-          <w:i w:val="0"/>
-          <w:sz w:val="22"/>
-        </w:rPr>
-        <w:t>O crescimento do comércio eletrônico brasileiro ampliou a ocorrência de experiências negativas de compra, convertidas em avaliações de baixa pontuação nos marketplaces. Este estudo investigou os fatores operacionais determinantes da insatisfação do consumidor no e-commerce brasileiro, operacionalizada pela contagem de reviews negativos (notas 1 e 2) por vendedor. Os dados foram provenientes do Brazilian E-Commerce Public Dataset (Olist, 2018), com 1.754 vendedores após aplicação do critério mínimo de 5 reviews. A análise adotou modelos de regressão para dados de contagem com offset de exposição: estimação de modelo Poisson como baseline, teste de sobredispersão de Cameron e Trivedi, estimação de modelo Binomial Negativa NB2 com parâmetro de dispersão estimado por máxima verossimilhança e seleção de modelo reduzido por AIC, BIC e qui-quadrado de Pearson. A sobredispersão severa (razão variância/média = 52,90; p = 3,88 × 10⁻¹⁰) confirmou a inadequação do Poisson e a necessidade do NB2. O modelo NB2 reduzido apresentou ajuste adequado (AIC = 6.976,7; Pearson χ²/gl = 1,05) e identificou seis determinantes significativos da taxa de insatisfação: atraso médio de entrega (+4,45% por dia), frete médio (+0,56% por R$) e quatro categorias de produto com taxas superiores à referência (esportes e lazer): telefonia (+38,2%), cama/mesa/banho (+33,4%), móveis/decoração (+29,2%) e informática/acessórios (+20,8%). Ticket médio, peso do produto e localização geográfica do vendedor não apresentaram associação significativa. Os resultados oferecem evidências quantitativas sobre os principais vetores operacionais da insatisfação do consumidor em marketplaces brasileiros.</w:t>
+        <w:t>Este estudo investigou fatores operacionais associados ? insatisfa??o expressa em reviews negativos no e-commerce brasileiro, operacionalizada pela contagem de avalia??es com notas 1 e 2 por vendedor. Os dados foram provenientes do Brazilian E-Commerce Public Dataset (Olist, 2018), com 1.754 vendedores ap?s aplica??o do crit?rio m?nimo de 5 reviews. A an?lise adotou modelos de regress?o para dados de contagem com offset de exposi??o: estima??o de modelo Poisson como baseline, teste de sobredispers?o de Cameron e Trivedi, estima??o de modelo Binomial Negativa NB2 com par?metro de dispers?o estimado por m?xima verossimilhan?a e sele??o de modelo reduzido por AIC, BIC e qui-quadrado de Pearson. A sobredispers?o severa (raz?o vari?ncia/m?dia = 52,90; teste de Cameron e Trivedi com p = 2,31 ? 10???) confirmou a inadequa??o do Poisson e justificou o uso do NB2. O modelo NB2 reduzido apresentou ajuste adequado (AIC = 6.976,7; Pearson ??/gl = 1,05) e identificou associa??es significativas com a taxa de reviews negativos: atraso m?dio de entrega (+4,45% por dia), frete m?dio (+0,56% por R$) e quatro categorias de produto com taxas superiores ao grupo de categorias omitidas no modelo reduzido ? telefonia (+38,2%), cama/mesa/banho (+33,4%), m?veis/decora??o (+29,2%) e inform?tica/acess?rios (+20,8%). Ticket m?dio, peso do produto e localiza??o geogr?fica do vendedor n?o apresentaram associa??o significativa. Os resultados oferecem evid?ncias quantitativas, de natureza associativa, sobre fatores operacionais relacionados ? taxa de reviews negativos em marketplaces brasileiros.</w:t>
       </w:r>
     </w:p>
     <w:p>
       <w:pPr>
-        <w:spacing w:before="0" w:after="240" w:line="220" w:lineRule="exact"/>
+        <w:spacing w:before="0" w:after="120" w:line="220" w:lineRule="exact"/>
         <w:jc w:val="both"/>
       </w:pPr>
       <w:r>
@@ -148,13 +100,7 @@
         <w:jc w:val="both"/>
       </w:pPr>
       <w:r>
-        <w:rPr>
-          <w:rFonts w:ascii="Arial" w:hAnsi="Arial"/>
-          <w:b w:val="0"/>
-          <w:i w:val="0"/>
-          <w:sz w:val="22"/>
-        </w:rPr>
-        <w:t>O comércio eletrônico brasileiro vem crescendo de forma consistente nos últimos anos. Com esse crescimento, multiplicam-se também as situações em que o consumidor tem uma experiência aquém do esperado, como atrasos na entrega, produtos que chegam danificados ou divergência entre o que foi anunciado e o que foi recebido. Essas experiências resultam, na maioria das vezes, em avaliações negativas nos marketplaces, o que prejudica tanto o vendedor quanto a plataforma como um todo. Luo e Homburg (2007) mostraram que os efeitos da satisfação do consumidor vão muito além da recompra, influenciando inclusive a eficiência dos investimentos em marketing, o que torna o tema relevante do ponto de vista financeiro.</w:t>
+        <w:t>O com?rcio eletr?nico brasileiro vem crescendo de forma consistente nos ?ltimos anos. Com esse crescimento, multiplicam-se tamb?m as situa??es em que o consumidor tem uma experi?ncia aqu?m do esperado, como atrasos na entrega, produtos que chegam danificados ou diverg?ncia entre o que foi anunciado e o que foi recebido. Essas experi?ncias costumam ser expressas em avalia??es negativas nos marketplaces, o que prejudica tanto o vendedor quanto a plataforma como um todo. Luo e Homburg (2007) mostraram que a satisfa??o do consumidor se relaciona n?o apenas ? recompra, mas tamb?m ? efici?ncia dos investimentos em marketing, o que torna o tema relevante do ponto de vista financeiro.</w:t>
       </w:r>
     </w:p>
     <w:p>
@@ -178,13 +124,7 @@
         <w:jc w:val="both"/>
       </w:pPr>
       <w:r>
-        <w:rPr>
-          <w:rFonts w:ascii="Arial" w:hAnsi="Arial"/>
-          <w:b w:val="0"/>
-          <w:i w:val="0"/>
-          <w:sz w:val="22"/>
-        </w:rPr>
-        <w:t>Diversos estudos confirmam que avaliações online exercem impacto direto sobre o desempenho comercial (Chevalier e Mayzlin, 2006; Zhu e Zhang, 2010; Mudambi e Schuff, 2010). A maioria dessas pesquisas, contudo, trata o fenômeno pelo lado do consumidor que lê o review. Pouco se investigou sobre os determinantes operacionais que levam um vendedor a acumular avaliações negativas, perspectiva que este trabalho explora.</w:t>
+        <w:t>Diversos estudos confirmam que avalia??es online est?o associadas ao desempenho comercial (Chevalier e Mayzlin, 2006; Zhu e Zhang, 2010; Mudambi e Schuff, 2010). A maioria dessas pesquisas, contudo, trata o fen?meno pelo lado do consumidor que l? o review. Pouco se investigou sobre os fatores operacionais associados ao ac?mulo de avalia??es negativas por vendedor, perspectiva que este trabalho explora.</w:t>
       </w:r>
     </w:p>
     <w:p>
@@ -193,13 +133,7 @@
         <w:jc w:val="both"/>
       </w:pPr>
       <w:r>
-        <w:rPr>
-          <w:rFonts w:ascii="Arial" w:hAnsi="Arial"/>
-          <w:b w:val="0"/>
-          <w:i w:val="0"/>
-          <w:sz w:val="22"/>
-        </w:rPr>
-        <w:t>A contagem de reviews negativos por vendedor é uma variável discreta e não-negativa, o que requer modelos de regressão próprios para dados de contagem. O modelo de Poisson é o ponto de partida natural, mas assume que a variância condicional é igual à média, pressuposto frequentemente violado em dados reais. Quando isso ocorre, configurando sobredispersão, a regressão Binomial Negativa é a alternativa recomendada (Cameron e Trivedi, 2013; Hilbe, 2011). Fávero e Belfiore (2024) detalham a aplicação prática desses modelos em contextos econômicos e de negócios. O objetivo deste trabalho foi identificar os determinantes da insatisfação do consumidor no e-commerce brasileiro, operacionalizada como a contagem de reviews negativos (notas 1 e 2) por vendedor, por meio de modelos de regressão para dados de contagem aplicados a dados transacionais públicos da plataforma Olist (Olist, 2018).</w:t>
+        <w:t>A contagem de reviews negativos por vendedor ? uma vari?vel discreta e n?o-negativa, o que requer modelos de regress?o pr?prios para dados de contagem. O modelo de Poisson ? o ponto de partida natural, mas assume que a vari?ncia condicional ? igual ? m?dia, pressuposto frequentemente violado em dados reais. Quando isso ocorre, configurando sobredispers?o, a regress?o Binomial Negativa ? a alternativa recomendada (Cameron e Trivedi, 2013; Hilbe, 2011). F?vero e Belfiore (2024) detalham a aplica??o pr?tica desses modelos em contextos econ?micos e de neg?cios. O objetivo deste trabalho foi identificar fatores operacionais associados ? insatisfa??o expressa em reviews negativos no e-commerce brasileiro, operacionalizada como a contagem de reviews negativos (notas 1 e 2) por vendedor, por meio de modelos de regress?o para dados de contagem aplicados a dados transacionais p?blicos da plataforma Olist (Olist, 2018).</w:t>
       </w:r>
     </w:p>
     <w:p>
@@ -1360,6 +1294,12 @@
       </w:r>
     </w:p>
     <w:p>
+      <w:pPr/>
+      <w:r>
+        <w:t>A passagem do NB2 completo para o reduzido implicou pequena redu??o da log-verossimilhan?a (de ?3.469,3 para ?3.480,3), compensada pela menor complexidade do modelo, refletida nos valores inferiores de AIC (de 6.998,6 para 6.976,7) e BIC (de 7.162,7 para 7.020,4). A escolha do modelo reduzido apoia-se, portanto, na combina??o entre parcim?nia, crit?rios de informa??o e coer?ncia substantiva das vari?veis retidas, e n?o apenas no corte por signific?ncia individual.</w:t>
+      </w:r>
+    </w:p>
+    <w:p>
       <w:pPr>
         <w:spacing w:before="200" w:after="40" w:line="220" w:lineRule="exact"/>
         <w:jc w:val="left"/>
@@ -1803,13 +1743,7 @@
         <w:jc w:val="both"/>
       </w:pPr>
       <w:r>
-        <w:rPr>
-          <w:rFonts w:ascii="Arial" w:hAnsi="Arial"/>
-          <w:b w:val="0"/>
-          <w:i w:val="0"/>
-          <w:sz w:val="22"/>
-        </w:rPr>
-        <w:t>O modelo NB2 reduzido reteve seis variáveis com coeficientes estatisticamente significativos ao nível de 5%: atraso médio de entrega, frete médio e quatro categorias de produto (telefonia, cama/mesa/banho, móveis/decoração e informática/acessórios). O parâmetro de dispersão estimado foi α = 0,1184. Os efeitos sobre a taxa esperada de insatisfação foram calculados pela equação (3) e estão apresentados na Tabela 4.</w:t>
+        <w:t>O modelo NB2 reduzido reteve seis vari?veis com coeficientes estatisticamente significativos ao n?vel de 5%: atraso m?dio de entrega, frete m?dio e quatro categorias de produto (telefonia, cama/mesa/banho, m?veis/decora??o e inform?tica/acess?rios). O par?metro de dispers?o estimado foi ? = 0,1184. As associa??es estimadas com a taxa esperada de insatisfa??o foram calculadas pela equa??o (3) e est?o apresentadas na Tabela 4.</w:t>
       </w:r>
     </w:p>
     <w:p>
@@ -2539,13 +2473,7 @@
         <w:jc w:val="left"/>
       </w:pPr>
       <w:r>
-        <w:rPr>
-          <w:rFonts w:ascii="Arial" w:hAnsi="Arial"/>
-          <w:b w:val="0"/>
-          <w:i w:val="0"/>
-          <w:sz w:val="22"/>
-        </w:rPr>
-        <w:t>Figura 4. Magnitudes dos efeitos significativos do modelo NB2 reduzido</w:t>
+        <w:t>Figura 4. Magnitudes das associa??es significativas do modelo NB2 reduzido</w:t>
       </w:r>
     </w:p>
     <w:p>
@@ -2609,13 +2537,7 @@
         <w:jc w:val="both"/>
       </w:pPr>
       <w:r>
-        <w:rPr>
-          <w:rFonts w:ascii="Arial" w:hAnsi="Arial"/>
-          <w:b w:val="0"/>
-          <w:i w:val="0"/>
-          <w:sz w:val="22"/>
-        </w:rPr>
-        <w:t>O atraso médio de entrega foi a variável com maior significância estatística: cada dia adicional de atraso está associado a um aumento de 4,45% na taxa esperada de insatisfação, mantidas as demais variáveis constantes [equação (1)]. O frete médio apresentou efeito positivo e significativo, de menor magnitude (0,56% por R$). Entre as categorias de produto, todas as quatro retidas no modelo apresentaram taxas de insatisfação significativamente superiores ao grupo de referência (esportes e lazer e demais categorias omitidas no modelo reduzido): telefonia (+38,2%), cama/mesa/banho (+33,4%), móveis/decoração (+29,2%) e informática/acessórios (+20,8%).</w:t>
+        <w:t>O atraso m?dio de entrega foi a vari?vel com maior signific?ncia estat?stica: cada dia adicional de atraso est? associado a um aumento de 4,45% na taxa esperada de insatisfa??o, mantidas as demais vari?veis constantes [equa??o (1)]. O frete m?dio apresentou associa??o positiva e significativa, de menor magnitude (0,56% por R$). Entre as categorias de produto, todas as quatro retidas no modelo apresentaram taxas de insatisfa??o significativamente superiores ao grupo de refer?ncia (esportes e lazer e demais categorias omitidas no modelo reduzido): telefonia (+38,2%), cama/mesa/banho (+33,4%), m?veis/decora??o (+29,2%) e inform?tica/acess?rios (+20,8%).</w:t>
       </w:r>
     </w:p>
     <w:p>
@@ -2624,13 +2546,7 @@
         <w:jc w:val="both"/>
       </w:pPr>
       <w:r>
-        <w:rPr>
-          <w:rFonts w:ascii="Arial" w:hAnsi="Arial"/>
-          <w:b w:val="0"/>
-          <w:i w:val="0"/>
-          <w:sz w:val="22"/>
-        </w:rPr>
-        <w:t>O ticket médio e o peso médio do produto não apresentaram associação estatisticamente significativa com a taxa de insatisfação (p &gt; 0,05) e foram removidos do modelo final. Nenhuma das dummies de unidade federativa foi significativa, indicando que, após controle pelos demais fatores operacionais, a localização geográfica do vendedor não apresentou poder explicativo adicional sobre a taxa de insatisfação nos dados analisados. Esse resultado diverge da expectativa inicial e pode refletir a concentração de vendedores no estado de São Paulo, o que reduz a variabilidade residual entre grupos geográficos após o controle das demais covariáveis.</w:t>
+        <w:t>O ticket m?dio e o peso m?dio do produto n?o apresentaram associa??o estatisticamente significativa com a taxa de insatisfa??o (p &gt; 0,05) e foram removidos do modelo final. Nenhuma das dummies de unidade federativa foi significativa, indicando que, ap?s controle pelos demais fatores operacionais, a localiza??o geogr?fica do vendedor n?o apresentou associa??o adicional com a taxa de insatisfa??o nos dados analisados. Esse resultado diverge da expectativa inicial e pode refletir a concentra??o de vendedores no estado de S?o Paulo, o que reduz a variabilidade residual entre grupos geogr?ficos ap?s o controle das demais covari?veis.</w:t>
       </w:r>
     </w:p>
     <w:p>
@@ -2756,13 +2672,25 @@
         <w:jc w:val="both"/>
       </w:pPr>
       <w:r>
-        <w:rPr>
-          <w:rFonts w:ascii="Arial" w:hAnsi="Arial"/>
-          <w:b w:val="0"/>
-          <w:i w:val="0"/>
-          <w:sz w:val="22"/>
-        </w:rPr>
-        <w:t>Os coeficientes estimados refletem associações condicionais entre as variáveis operacionais e a taxa de reviews negativos, não devendo ser interpretados como efeitos causais, dada a natureza observacional dos dados e a possível omissão de variáveis não observadas (qualidade do atendimento, embalagem, comunicação pós-venda, transportadora). Adicionalmente, atraso, frete e categoria de produto guardam correlações operacionais esperadas — produtos mais pesados tendem a apresentar frete e prazo de entrega superiores —, o que implica que parte do efeito do frete pode estar capturando heterogeneidade logística associada à categoria. O filtro de pelo menos 5 reviews restringe a análise a vendedores com volume mínimo de operação, limitando a generalização dos resultados a esse perfil. Por fim, na construção da base, pedidos com múltiplos vendedores tiveram o review atribuído a apenas um vendedor por meio de deduplicação por order_id; o impacto dessa simplificação é marginal, pois apenas 1,30% dos pedidos da base contam com mais de um vendedor.</w:t>
+        <w:t>Os coeficientes estimados refletem associa??es condicionais entre as vari?veis operacionais e a taxa de reviews negativos, n?o devendo ser interpretados como efeitos causais, dada a natureza observacional dos dados e a poss?vel omiss?o de vari?veis n?o observadas (qualidade do atendimento, embalagem, comunica??o p?s-venda, transportadora). Adicionalmente, atraso, frete e categoria de produto guardam correla??es operacionais esperadas ? produtos mais pesados tendem a apresentar frete e prazo de entrega superiores ?, o que implica que parte da associa??o estimada para o frete pode estar capturando heterogeneidade log?stica associada ? categoria. O filtro de pelo menos 5 reviews restringe a an?lise a vendedores com volume m?nimo de opera??o, limitando a generaliza??o dos resultados a esse perfil. Por fim, na constru??o da base, pedidos com m?ltiplos vendedores tiveram o review atribu?do a apenas um vendedor por meio de deduplica??o por order_id; o alcance dessa simplifica??o ? marginal, pois apenas 1,30% dos pedidos da base contam com mais de um vendedor.</w:t>
+      </w:r>
+    </w:p>
+    <w:p>
+      <w:pPr/>
+      <w:r>
+        <w:t>A contagem de reviews negativos deve ser interpretada como proxy de insatisfa??o expressa por consumidores que efetivamente avaliaram a compra. A medida n?o captura consumidores insatisfeitos que n?o deixaram avalia??o e pode refletir vi?s de sele??o no comportamento de avalia??o online.</w:t>
+      </w:r>
+    </w:p>
+    <w:p>
+      <w:pPr/>
+      <w:r>
+        <w:t>A base utilizada cobre pedidos de 2016 a 2018 e reflete a opera??o da Olist nesse per?odo; a generaliza??o dos resultados para o e-commerce brasileiro contempor?neo deve considerar mudan?as posteriores em log?stica, comportamento do consumidor e composi??o da plataforma.</w:t>
+      </w:r>
+    </w:p>
+    <w:p>
+      <w:pPr/>
+      <w:r>
+        <w:t>Como os reviews negativos constituem um subconjunto do total de reviews recebidos por vendedor, modelos para propor??o, como especifica??es binomiais, quasi-binomiais ou beta-binomiais, poderiam ser considerados em an?lises futuras. Neste estudo, optou-se pela NB2 com offset log(total de reviews) por se tratar de abordagem consolidada para taxas de eventos em dados de contagem com sobredispers?o.</w:t>
       </w:r>
     </w:p>
     <w:p>
@@ -2771,13 +2699,7 @@
         <w:jc w:val="both"/>
       </w:pPr>
       <w:r>
-        <w:rPr>
-          <w:rFonts w:ascii="Arial" w:hAnsi="Arial"/>
-          <w:b w:val="0"/>
-          <w:i w:val="0"/>
-          <w:sz w:val="22"/>
-        </w:rPr>
-        <w:t>Modelos inflacionados de zeros (ZIP e ZINB) foram considerados como alternativas, dada a ocorrência de aproximadamente 21% de zeros na variável dependente (Lambert, 1992). A verificação formal foi realizada pelo teste de Vuong (1989), comparando o NB2 reduzido com o modelo ZINB de mesma especificação no componente de contagem. A estatística obtida foi z = 0,0010 (p-valor = 0,4996), não rejeitando a hipótese nula de ausência de inflação de zeros, e o critério AIC favoreceu o NB2 (6.976,7) em relação ao ZINB (6.978,7). Dessa forma, o NB2 padrão acomoda satisfatoriamente os zeros amostrais, dispensando a complexidade adicional dos modelos inflacionados (Fávero, Duarte e Santos, 2024).</w:t>
+        <w:t>Modelos inflacionados de zeros (ZIP e ZINB) foram considerados como alternativas, dada a ocorr?ncia de aproximadamente 21% de zeros na vari?vel dependente (Lambert, 1992). A compara??o entre o NB2 reduzido e o ZINB de mesma especifica??o no componente de contagem foi conduzida pelo teste de Vuong (1989), que n?o indicou superioridade estat?stica do ZINB sobre o NB2 (z = 0,0010; p = 0,4996). O crit?rio AIC tamb?m favoreceu o NB2 (6.976,7) frente ao ZINB (6.978,7). A especifica??o NB2 foi mantida por acomodar satisfatoriamente os zeros amostrais sem a complexidade adicional de um componente inflado de zeros (F?vero, Duarte e Santos, 2024).</w:t>
       </w:r>
     </w:p>
     <w:p>
@@ -3021,6 +2943,8 @@
       </w:r>
     </w:p>
     <w:sectPr>
+      <w:headerReference w:type="default" r:id="rId14"/>
+      <w:footerReference w:type="default" r:id="rId15"/>
       <w:pgSz w:w="12240" w:h="15840"/>
       <w:pgMar w:top="1417" w:right="1417" w:bottom="1417" w:left="1417" w:header="720" w:footer="720" w:gutter="0"/>
       <w:cols w:space="720"/>
@@ -3028,6 +2952,26 @@
     </w:sectPr>
   </w:body>
 </w:document>
+</file>
+
+<file path=word/footer1.xml><?xml version="1.0" encoding="utf-8"?>
+<w:ftr xmlns:m="http://schemas.openxmlformats.org/officeDocument/2006/math" xmlns:mc="http://schemas.openxmlformats.org/markup-compatibility/2006" xmlns:mo="http://schemas.microsoft.com/office/mac/office/2008/main" xmlns:mv="urn:schemas-microsoft-com:mac:vml" xmlns:o="urn:schemas-microsoft-com:office:office" xmlns:r="http://schemas.openxmlformats.org/officeDocument/2006/relationships" xmlns:v="urn:schemas-microsoft-com:vml" xmlns:w10="urn:schemas-microsoft-com:office:word" xmlns:w14="http://schemas.microsoft.com/office/word/2010/wordml" xmlns:w="http://schemas.openxmlformats.org/wordprocessingml/2006/main" xmlns:wne="http://schemas.microsoft.com/office/word/2006/wordml" xmlns:wp14="http://schemas.microsoft.com/office/word/2010/wordprocessingDrawing" xmlns:wp="http://schemas.openxmlformats.org/drawingml/2006/wordprocessingDrawing" xmlns:wpc="http://schemas.microsoft.com/office/word/2010/wordprocessingCanvas" xmlns:wpg="http://schemas.microsoft.com/office/word/2010/wordprocessingGroup" xmlns:wpi="http://schemas.microsoft.com/office/word/2010/wordprocessingInk" xmlns:wps="http://schemas.microsoft.com/office/word/2010/wordprocessingShape" mc:Ignorable="w14 wp14">
+  <w:p>
+    <w:pPr>
+      <w:pStyle w:val="Footer"/>
+    </w:pPr>
+  </w:p>
+</w:ftr>
+</file>
+
+<file path=word/header1.xml><?xml version="1.0" encoding="utf-8"?>
+<w:hdr xmlns:m="http://schemas.openxmlformats.org/officeDocument/2006/math" xmlns:mc="http://schemas.openxmlformats.org/markup-compatibility/2006" xmlns:mo="http://schemas.microsoft.com/office/mac/office/2008/main" xmlns:mv="urn:schemas-microsoft-com:mac:vml" xmlns:o="urn:schemas-microsoft-com:office:office" xmlns:r="http://schemas.openxmlformats.org/officeDocument/2006/relationships" xmlns:v="urn:schemas-microsoft-com:vml" xmlns:w10="urn:schemas-microsoft-com:office:word" xmlns:w14="http://schemas.microsoft.com/office/word/2010/wordml" xmlns:w="http://schemas.openxmlformats.org/wordprocessingml/2006/main" xmlns:wne="http://schemas.microsoft.com/office/word/2006/wordml" xmlns:wp14="http://schemas.microsoft.com/office/word/2010/wordprocessingDrawing" xmlns:wp="http://schemas.openxmlformats.org/drawingml/2006/wordprocessingDrawing" xmlns:wpc="http://schemas.microsoft.com/office/word/2010/wordprocessingCanvas" xmlns:wpg="http://schemas.microsoft.com/office/word/2010/wordprocessingGroup" xmlns:wpi="http://schemas.microsoft.com/office/word/2010/wordprocessingInk" xmlns:wps="http://schemas.microsoft.com/office/word/2010/wordprocessingShape" mc:Ignorable="w14 wp14">
+  <w:p>
+    <w:pPr>
+      <w:pStyle w:val="Header"/>
+    </w:pPr>
+  </w:p>
+</w:hdr>
 </file>
 
 <file path=word/numbering.xml><?xml version="1.0" encoding="utf-8"?>

</xml_diff>